<commit_message>
fix(revenus-passifs): corrige la leçon 09 et durcit le prompt (C1 test des unités, B2 bis lien mort par son code, A2 fait prêté à une page) ; ㉘ bis — un ⛔ seul ne déclare pas un lien mort ; B-NOM lit « a publié / alerte » et ignore le développé d'un sigle
Co-Authored-By: Claude Opus 5 <noreply@anthropic.com>
</commit_message>
<xml_diff>
--- a/livrables/lecons/2026-09-20_lecon-revenus-passifs_09_outils-automatisation-ia-mesure-maintenance.docx
+++ b/livrables/lecons/2026-09-20_lecon-revenus-passifs_09_outils-automatisation-ia-mesure-maintenance.docx
@@ -859,7 +859,18 @@
                 <w:sz w:val="20"/>
                 <w:szCs w:val="20"/>
               </w:rPr>
-              <w:t xml:space="preserve">Tous les tarifs cloud sont facturés annuellement · n8n est open source : auto-hébergement possible (serveur seul)</w:t>
+              <w:t xml:space="preserve">Prix affichés en facturation annuelle (« Annually — Save 17% ») ; facturation mensuelle possible, plus chère · n8n est open source : auto-hébergement possible (serveur seul) </w:t>
+            </w:r>
+            <w:r>
+              <w:rPr>
+                <w:rFonts w:ascii="Times New Roman" w:cs="Times New Roman" w:eastAsia="Times New Roman" w:hAnsi="Times New Roman"/>
+                <w:i/>
+                <w:iCs/>
+                <w:color w:val="6B7280"/>
+                <w:sz w:val="18"/>
+                <w:szCs w:val="18"/>
+              </w:rPr>
+              <w:t xml:space="preserve">[Corrigé le 20/09/2026 : « tous les tarifs cloud sont facturés annuellement » — la page a un sélecteur Monthly / Annually.]</w:t>
             </w:r>
           </w:p>
         </w:tc>
@@ -943,7 +954,7 @@
           <w:sz w:val="22"/>
           <w:szCs w:val="22"/>
         </w:rPr>
-        <w:t xml:space="preserve">Utiliser l'IA dans un business numérique passif se fait principalement via des API (interfaces de programmation). On paye à l'usage, selon le volume de texte traité. L'unité est le token (environ 750 tokens ≈ 500 mots en français).</w:t>
+        <w:t xml:space="preserve">Utiliser l'IA dans un business numérique passif se fait principalement via des API (interfaces de programmation). On paye à l'usage, selon le volume de texte traité. L'unité est le token (ordre de grandeur usuel, non sourcé : environ 750 tokens pour 500 mots de français).</w:t>
       </w:r>
     </w:p>
     <w:p>
@@ -2020,7 +2031,18 @@
                 <w:sz w:val="20"/>
                 <w:szCs w:val="20"/>
               </w:rPr>
-              <w:t xml:space="preserve">⚠️ Source secondaire — page plausible.io/pricing non lisible (JS requis, ⛔) — à vérifier directement sur le site</w:t>
+              <w:t xml:space="preserve">Source primaire : page d'accueil plausible.io (section Pricing) — Starter à « $9 /month » pour « Up to 10k monthly pageviews », lu dans le HTML le 20/09/2026 </w:t>
+            </w:r>
+            <w:r>
+              <w:rPr>
+                <w:rFonts w:ascii="Times New Roman" w:cs="Times New Roman" w:eastAsia="Times New Roman" w:hAnsi="Times New Roman"/>
+                <w:i/>
+                <w:iCs/>
+                <w:color w:val="6B7280"/>
+                <w:sz w:val="18"/>
+                <w:szCs w:val="18"/>
+              </w:rPr>
+              <w:t xml:space="preserve">[Corrigé le 20/09/2026 : l'adresse plausible.io/pricing répond 404, pas « JS requis » ; les tarifs sont sur la page d'accueil.]</w:t>
             </w:r>
           </w:p>
         </w:tc>
@@ -3030,16 +3052,27 @@
           <w:ilvl w:val="0"/>
           <w:numId w:val="1"/>
         </w:numPr>
-        <w:spacing w:after="40" w:before="40"/>
-      </w:pPr>
-      <w:r>
-        <w:rPr>
-          <w:rFonts w:ascii="Times New Roman" w:cs="Times New Roman" w:eastAsia="Times New Roman" w:hAnsi="Times New Roman"/>
-          <w:color w:val="1F2937"/>
-          <w:sz w:val="22"/>
-          <w:szCs w:val="22"/>
-        </w:rPr>
-        <w:t xml:space="preserve">Les plateformes évoluent ou ferment : Zapier a changé sa grille tarifaire plusieurs fois en 5 ans. n8n a migré ses utilisateurs cloud vers une nouvelle tarification en 2024. La dépendance à un outil tiers est un risque stratégique (vendor lock-in).</w:t>
+        <w:spacing w:after="60" w:before="60"/>
+      </w:pPr>
+      <w:r>
+        <w:rPr>
+          <w:rFonts w:ascii="Times New Roman" w:cs="Times New Roman" w:eastAsia="Times New Roman" w:hAnsi="Times New Roman"/>
+          <w:color w:val="1F2937"/>
+          <w:sz w:val="22"/>
+          <w:szCs w:val="22"/>
+        </w:rPr>
+        <w:t xml:space="preserve">Les plateformes évoluent ou ferment : les grilles tarifaires de cette leçon sont celles du 20/09/2026 (Zapier affiche un rabais annuel de 33 %, n8n de 17 % — signe que les grilles bougent). La dépendance à un outil tiers est un risque stratégique (vendor lock-in). </w:t>
+      </w:r>
+      <w:r>
+        <w:rPr>
+          <w:rFonts w:ascii="Times New Roman" w:cs="Times New Roman" w:eastAsia="Times New Roman" w:hAnsi="Times New Roman"/>
+          <w:i/>
+          <w:iCs/>
+          <w:color w:val="6B7280"/>
+          <w:sz w:val="20"/>
+          <w:szCs w:val="20"/>
+        </w:rPr>
+        <w:t xml:space="preserve">[Corrigé le 20/09/2026 : « Zapier a changé sa grille plusieurs fois en 5 ans » et « n8n a migré ses utilisateurs cloud … en 2024 » étaient deux faits de mémoire, sans page.]</w:t>
       </w:r>
     </w:p>
     <w:p>
@@ -3178,7 +3211,18 @@
           <w:sz w:val="22"/>
           <w:szCs w:val="22"/>
         </w:rPr>
-        <w:t xml:space="preserve">• Garantie de résultat sur un revenu : illégale en France (art. L121-2 du Code de la consommation)</w:t>
+        <w:t xml:space="preserve">• Garantie de résultat sur un revenu : peut relever de la pratique commerciale trompeuse (art. L121-2 du Code de la consommation) — une promesse de gain sans conditions ni taux d'échec en est un cas typique </w:t>
+      </w:r>
+      <w:r>
+        <w:rPr>
+          <w:rFonts w:ascii="Times New Roman" w:cs="Times New Roman" w:eastAsia="Times New Roman" w:hAnsi="Times New Roman"/>
+          <w:i/>
+          <w:iCs/>
+          <w:color w:val="6B7280"/>
+          <w:sz w:val="20"/>
+          <w:szCs w:val="20"/>
+        </w:rPr>
+        <w:t xml:space="preserve">[Corrigé le 20/09/2026 : « illégale en France » — L121-2 définit la pratique commerciale trompeuse ; il ne rend pas une garantie illégale en soi.]</w:t>
       </w:r>
     </w:p>
     <w:p>
@@ -3238,7 +3282,18 @@
           <w:sz w:val="22"/>
           <w:szCs w:val="22"/>
         </w:rPr>
-        <w:t xml:space="preserve">L'AMF (Autorité des marchés financiers) a publié des mises en garde contre les offres frauduleuses liées aux robots de trading et aux formations à l'investissement (source : amf-france.org). Un rapport AMF/BVA d'octobre 2024 porte sur les arnaques à l'investissement en ligne. Les chiffres précis de ce rapport (pertes moyennes, profils victimes) n'ont pas pu être extraits lors de cette exécution (PDF non lisible par l'outil de fetch) — consulter directement le rapport sur amf-france.org pour les données chiffrées officielles.</w:t>
+        <w:t xml:space="preserve">La page « espace épargnants » de l'AMF (amf-france.org, consultée le 20/09/2026) alerte sur la multiplication des arnaques prenant la forme de faux articles de presse et publie des radiations d'acteurs ; c'est la référence à consulter pour les listes noires et les mises en garde. Un rapport AMF/BVA d'octobre 2024 sur les arnaques à l'investissement en ligne est cité ici de mémoire : ses chiffres (pertes moyennes, profils de victimes) n'ont pas été extraits lors de cette exécution (PDF non lisible par l'outil) — consulter directement le rapport sur amf-france.org. </w:t>
+      </w:r>
+      <w:r>
+        <w:rPr>
+          <w:rFonts w:ascii="Times New Roman" w:cs="Times New Roman" w:eastAsia="Times New Roman" w:hAnsi="Times New Roman"/>
+          <w:i/>
+          <w:iCs/>
+          <w:color w:val="6B7280"/>
+          <w:sz w:val="20"/>
+          <w:szCs w:val="20"/>
+        </w:rPr>
+        <w:t xml:space="preserve">[Corrigé le 20/09/2026 : la phrase prêtait à la page « des mises en garde contre les offres frauduleuses liées aux robots de trading et aux formations à l'investissement » ; elle ne porte ni « robot », ni « trading », ni « mise en garde ».]</w:t>
       </w:r>
     </w:p>
     <w:p>
@@ -3518,49 +3573,60 @@
           <w:sz w:val="22"/>
           <w:szCs w:val="22"/>
         </w:rPr>
-        <w:t xml:space="preserve">A. 50 ventes/mois (3 modules/workflow = 150 crédits Make, 50 tâches Zapier, 50 exécutions n8n) :</w:t>
-      </w:r>
-    </w:p>
-    <w:p>
-      <w:pPr>
-        <w:pBdr>
-          <w:left w:val="single" w:color="1B3A6B" w:sz="12"/>
-        </w:pBdr>
-        <w:shd w:fill="EEF2F7" w:val="clear"/>
-        <w:spacing w:after="60" w:before="60"/>
-        <w:ind w:left="400"/>
-      </w:pPr>
-      <w:r>
-        <w:rPr>
-          <w:rFonts w:ascii="Times New Roman" w:cs="Times New Roman" w:eastAsia="Times New Roman" w:hAnsi="Times New Roman"/>
-          <w:i/>
-          <w:iCs/>
-          <w:color w:val="1F2937"/>
-          <w:sz w:val="22"/>
-          <w:szCs w:val="22"/>
-        </w:rPr>
-        <w:t xml:space="preserve">   • Zapier Free ($0) : suffisant — 50 tâches &lt; plafond de 100 tâches/mois</w:t>
-      </w:r>
-    </w:p>
-    <w:p>
-      <w:pPr>
-        <w:pBdr>
-          <w:left w:val="single" w:color="1B3A6B" w:sz="12"/>
-        </w:pBdr>
-        <w:shd w:fill="EEF2F7" w:val="clear"/>
-        <w:spacing w:after="60" w:before="60"/>
-        <w:ind w:left="400"/>
-      </w:pPr>
-      <w:r>
-        <w:rPr>
-          <w:rFonts w:ascii="Times New Roman" w:cs="Times New Roman" w:eastAsia="Times New Roman" w:hAnsi="Times New Roman"/>
-          <w:i/>
-          <w:iCs/>
-          <w:color w:val="1F2937"/>
-          <w:sz w:val="22"/>
-          <w:szCs w:val="22"/>
-        </w:rPr>
-        <w:t xml:space="preserve">   • Make Free ($0) : suffisant — 150 crédits &lt;&lt; plafond de 1 000 crédits/mois</w:t>
+        <w:t xml:space="preserve">A. 50 ventes/mois — traduction dans chaque unité, comme la théorie l'exige : Make 50 × 4 modules (le déclencheur compte aussi) = 200 crédits ; Zapier 50 × 3 actions = 150 tâches (le déclencheur est gratuit) ; n8n 50 × 1 = 50 exécutions : </w:t>
+      </w:r>
+      <w:r>
+        <w:rPr>
+          <w:rFonts w:ascii="Times New Roman" w:cs="Times New Roman" w:eastAsia="Times New Roman" w:hAnsi="Times New Roman"/>
+          <w:i/>
+          <w:iCs/>
+          <w:color w:val="6B7280"/>
+          <w:sz w:val="20"/>
+          <w:szCs w:val="20"/>
+        </w:rPr>
+        <w:t xml:space="preserve">[Corrigé le 20/09/2026 : le corrigé écrivait « 150 crédits Make, 50 tâches Zapier » — une tâche par vente, contre la théorie de la leçon (« chaque action exécutée = 1 tâche »).]</w:t>
+      </w:r>
+    </w:p>
+    <w:p>
+      <w:pPr>
+        <w:pBdr>
+          <w:left w:val="single" w:color="1B3A6B" w:sz="12"/>
+        </w:pBdr>
+        <w:shd w:fill="EEF2F7" w:val="clear"/>
+        <w:spacing w:after="60" w:before="60"/>
+        <w:ind w:left="400"/>
+      </w:pPr>
+      <w:r>
+        <w:rPr>
+          <w:rFonts w:ascii="Times New Roman" w:cs="Times New Roman" w:eastAsia="Times New Roman" w:hAnsi="Times New Roman"/>
+          <w:i/>
+          <w:iCs/>
+          <w:color w:val="1F2937"/>
+          <w:sz w:val="22"/>
+          <w:szCs w:val="22"/>
+        </w:rPr>
+        <w:t xml:space="preserve">   • Zapier Free ($0) : INSUFFISANT deux fois — le plan gratuit est limité aux workflows à deux étapes (« Two-step Zap workflows »), or celui-ci en a quatre (déclencheur + 3 actions) ; et 150 tâches &gt; plafond de 100. Il faut Professional 750 tâches : $19,99/mois (annuel) dès 50 ventes</w:t>
+      </w:r>
+    </w:p>
+    <w:p>
+      <w:pPr>
+        <w:pBdr>
+          <w:left w:val="single" w:color="1B3A6B" w:sz="12"/>
+        </w:pBdr>
+        <w:shd w:fill="EEF2F7" w:val="clear"/>
+        <w:spacing w:after="60" w:before="60"/>
+        <w:ind w:left="400"/>
+      </w:pPr>
+      <w:r>
+        <w:rPr>
+          <w:rFonts w:ascii="Times New Roman" w:cs="Times New Roman" w:eastAsia="Times New Roman" w:hAnsi="Times New Roman"/>
+          <w:i/>
+          <w:iCs/>
+          <w:color w:val="1F2937"/>
+          <w:sz w:val="22"/>
+          <w:szCs w:val="22"/>
+        </w:rPr>
+        <w:t xml:space="preserve">   • Make Free ($0) : suffisant — 200 crédits &lt; plafond de 1 000 crédits/mois</w:t>
       </w:r>
     </w:p>
     <w:p>
@@ -3602,7 +3668,7 @@
           <w:sz w:val="22"/>
           <w:szCs w:val="22"/>
         </w:rPr>
-        <w:t xml:space="preserve">   → Recommandation pour ce volume : Make Free ou Zapier Free, selon les intégrations dont vous avez besoin</w:t>
+        <w:t xml:space="preserve">   → Recommandation pour ce volume : Make Free (n8n Starter à €20 est surdimensionné, Zapier exige un plan payant à cause des étapes)</w:t>
       </w:r>
     </w:p>
     <w:p>
@@ -3644,49 +3710,60 @@
           <w:sz w:val="22"/>
           <w:szCs w:val="22"/>
         </w:rPr>
-        <w:t xml:space="preserve">B. 500 ventes/mois (1 500 crédits Make, 500 tâches Zapier, 500 exécutions n8n) :</w:t>
-      </w:r>
-    </w:p>
-    <w:p>
-      <w:pPr>
-        <w:pBdr>
-          <w:left w:val="single" w:color="1B3A6B" w:sz="12"/>
-        </w:pBdr>
-        <w:shd w:fill="EEF2F7" w:val="clear"/>
-        <w:spacing w:after="60" w:before="60"/>
-        <w:ind w:left="400"/>
-      </w:pPr>
-      <w:r>
-        <w:rPr>
-          <w:rFonts w:ascii="Times New Roman" w:cs="Times New Roman" w:eastAsia="Times New Roman" w:hAnsi="Times New Roman"/>
-          <w:i/>
-          <w:iCs/>
-          <w:color w:val="1F2937"/>
-          <w:sz w:val="22"/>
-          <w:szCs w:val="22"/>
-        </w:rPr>
-        <w:t xml:space="preserve">   • Zapier Free : INSUFFISANT — 500 tâches &gt; plafond de 100. Upgrade nécessaire vers Professional 750 tâches : $19,99/mois (annuel) = $239,88/an</w:t>
-      </w:r>
-    </w:p>
-    <w:p>
-      <w:pPr>
-        <w:pBdr>
-          <w:left w:val="single" w:color="1B3A6B" w:sz="12"/>
-        </w:pBdr>
-        <w:shd w:fill="EEF2F7" w:val="clear"/>
-        <w:spacing w:after="60" w:before="60"/>
-        <w:ind w:left="400"/>
-      </w:pPr>
-      <w:r>
-        <w:rPr>
-          <w:rFonts w:ascii="Times New Roman" w:cs="Times New Roman" w:eastAsia="Times New Roman" w:hAnsi="Times New Roman"/>
-          <w:i/>
-          <w:iCs/>
-          <w:color w:val="1F2937"/>
-          <w:sz w:val="22"/>
-          <w:szCs w:val="22"/>
-        </w:rPr>
-        <w:t xml:space="preserve">   • Make Core ($9/mois, mensuel) : SUFFISANT — 1 500 crédits &lt; plafond de 10 000. Budget annuel : $108 (sans remise annuelle) ou moins avec l'engagement annuel (-15 %+)</w:t>
+        <w:t xml:space="preserve">B. 500 ventes/mois — Make 500 × 4 = 2 000 crédits ; Zapier 500 × 3 = 1 500 tâches ; n8n 500 exécutions : </w:t>
+      </w:r>
+      <w:r>
+        <w:rPr>
+          <w:rFonts w:ascii="Times New Roman" w:cs="Times New Roman" w:eastAsia="Times New Roman" w:hAnsi="Times New Roman"/>
+          <w:i/>
+          <w:iCs/>
+          <w:color w:val="6B7280"/>
+          <w:sz w:val="20"/>
+          <w:szCs w:val="20"/>
+        </w:rPr>
+        <w:t xml:space="preserve">[Corrigé le 20/09/2026 : « 1 500 crédits Make, 500 tâches Zapier » — même erreur d'unité.]</w:t>
+      </w:r>
+    </w:p>
+    <w:p>
+      <w:pPr>
+        <w:pBdr>
+          <w:left w:val="single" w:color="1B3A6B" w:sz="12"/>
+        </w:pBdr>
+        <w:shd w:fill="EEF2F7" w:val="clear"/>
+        <w:spacing w:after="60" w:before="60"/>
+        <w:ind w:left="400"/>
+      </w:pPr>
+      <w:r>
+        <w:rPr>
+          <w:rFonts w:ascii="Times New Roman" w:cs="Times New Roman" w:eastAsia="Times New Roman" w:hAnsi="Times New Roman"/>
+          <w:i/>
+          <w:iCs/>
+          <w:color w:val="1F2937"/>
+          <w:sz w:val="22"/>
+          <w:szCs w:val="22"/>
+        </w:rPr>
+        <w:t xml:space="preserve">   • Zapier Professional 750 tâches ($19,99/mois annuel) : INSUFFISANT — 1 500 tâches &gt; 750. Il faut le palier suivant du sélecteur de tâches (1,5K ou 2K tâches/mois) ; son prix est rendu en JavaScript sur zapier.com/pricing et n'a pas été lu dans le HTML — à relever sur la page (sélecteur « How many tasks do you need? »)</w:t>
+      </w:r>
+    </w:p>
+    <w:p>
+      <w:pPr>
+        <w:pBdr>
+          <w:left w:val="single" w:color="1B3A6B" w:sz="12"/>
+        </w:pBdr>
+        <w:shd w:fill="EEF2F7" w:val="clear"/>
+        <w:spacing w:after="60" w:before="60"/>
+        <w:ind w:left="400"/>
+      </w:pPr>
+      <w:r>
+        <w:rPr>
+          <w:rFonts w:ascii="Times New Roman" w:cs="Times New Roman" w:eastAsia="Times New Roman" w:hAnsi="Times New Roman"/>
+          <w:i/>
+          <w:iCs/>
+          <w:color w:val="1F2937"/>
+          <w:sz w:val="22"/>
+          <w:szCs w:val="22"/>
+        </w:rPr>
+        <w:t xml:space="preserve">   • Make Core ($9/mois, mensuel) : SUFFISANT — 2 000 crédits &lt; plafond de 10 000. Budget annuel : $108 (sans remise annuelle) ou moins avec l'engagement annuel (−15 %+)</w:t>
       </w:r>
     </w:p>
     <w:p>
@@ -3728,7 +3805,7 @@
           <w:sz w:val="22"/>
           <w:szCs w:val="22"/>
         </w:rPr>
-        <w:t xml:space="preserve">   → Moins cher pour ce volume : Make Core à ~$108/an (mensuel) vs Zapier à $239,88/an vs n8n à €240/an</w:t>
+        <w:t xml:space="preserve">   → Moins cher pour ce volume : Make Core à ~$108/an (mensuel) vs n8n à €240/an vs Zapier au-delà de $239,88/an (palier &gt; 750 tâches, prix à lire sur la page)</w:t>
       </w:r>
     </w:p>
     <w:p>
@@ -3770,7 +3847,18 @@
           <w:sz w:val="22"/>
           <w:szCs w:val="22"/>
         </w:rPr>
-        <w:t xml:space="preserve">C. Si vous dépassez 100 ventes/mois avec Zapier Free : les automatisations s'arrêtent dès le plafond atteint.</w:t>
+        <w:t xml:space="preserve">C. Le plan gratuit Zapier ne fait pas tourner ce workflow (deux étapes maximum) ; sur un workflow à deux étapes, le plafond de 100 tâches est atteint dès 50 ventes (2 actions × 50) : les automatisations s'arrêtent dès le plafond atteint. </w:t>
+      </w:r>
+      <w:r>
+        <w:rPr>
+          <w:rFonts w:ascii="Times New Roman" w:cs="Times New Roman" w:eastAsia="Times New Roman" w:hAnsi="Times New Roman"/>
+          <w:i/>
+          <w:iCs/>
+          <w:color w:val="6B7280"/>
+          <w:sz w:val="20"/>
+          <w:szCs w:val="20"/>
+        </w:rPr>
+        <w:t xml:space="preserve">[Corrigé le 20/09/2026 : « Si vous dépassez 100 ventes/mois avec Zapier Free » — le plafond se compte en tâches, pas en ventes.]</w:t>
       </w:r>
     </w:p>
     <w:p>
@@ -5493,7 +5581,18 @@
           <w:sz w:val="22"/>
           <w:szCs w:val="22"/>
         </w:rPr>
-        <w:t xml:space="preserve">   • Make Core : $9,00/mois (mensuel) — 10 000 crédits largement suffisants pour 20 workflows × 3 modules = 60 crédits</w:t>
+        <w:t xml:space="preserve">   • Make Core : $9,00/mois (mensuel) — 10 000 crédits largement suffisants pour 20 ventes × 4 modules (déclencheur compris) = 80 crédits </w:t>
+      </w:r>
+      <w:r>
+        <w:rPr>
+          <w:rFonts w:ascii="Times New Roman" w:cs="Times New Roman" w:eastAsia="Times New Roman" w:hAnsi="Times New Roman"/>
+          <w:i/>
+          <w:iCs/>
+          <w:color w:val="6B7280"/>
+          <w:sz w:val="20"/>
+          <w:szCs w:val="20"/>
+        </w:rPr>
+        <w:t xml:space="preserve">[Corrigé le 20/09/2026 : « 20 workflows × 3 modules = 60 crédits » ne comptait pas le module déclencheur.]</w:t>
       </w:r>
     </w:p>
     <w:p>
@@ -6107,9 +6206,25 @@
             <w:szCs w:val="22"/>
             <w:u w:val="single"/>
           </w:rPr>
-          <w:t xml:space="preserve">Plausible Analytics — tarifs (⛔ page JS-only, non lue lors de cette exécution — à consulter directement)</w:t>
+          <w:t xml:space="preserve">Plausible Analytics — tarifs (page d'accueil, section Pricing — lue le 20/09/2026)</w:t>
         </w:r>
       </w:hyperlink>
+    </w:p>
+    <w:p>
+      <w:pPr>
+        <w:spacing w:after="60" w:before="60"/>
+      </w:pPr>
+      <w:r>
+        <w:rPr>
+          <w:rFonts w:ascii="Times New Roman" w:cs="Times New Roman" w:eastAsia="Times New Roman" w:hAnsi="Times New Roman"/>
+          <w:i/>
+          <w:iCs/>
+          <w:color w:val="6B7280"/>
+          <w:sz w:val="20"/>
+          <w:szCs w:val="20"/>
+        </w:rPr>
+        <w:t xml:space="preserve">[Corrigé le 20/09/2026 : le lien pointait vers plausible.io/pricing, qui répond 404 ; il était déclaré « JS-only ». Retargeté vers la page d'accueil, qui porte les tarifs.]</w:t>
+      </w:r>
     </w:p>
     <w:p>
       <w:pPr>
@@ -6308,7 +6423,18 @@
           <w:sz w:val="22"/>
           <w:szCs w:val="22"/>
         </w:rPr>
-        <w:t xml:space="preserve">• Plausible Analytics — tarifs — page JavaScript-only, inaccessible via fetch et curl (lien dans les ressources ci-dessus). Les tarifs cités en section 3 proviennent de sources secondaires (comparateurs) : à vérifier sur le site officiel.</w:t>
+        <w:t xml:space="preserve">• Plausible Analytics — l'adresse /pricing répond 404 ; les tarifs ont été relus le 20/09/2026 sur la page d'accueil (section Pricing). </w:t>
+      </w:r>
+      <w:r>
+        <w:rPr>
+          <w:rFonts w:ascii="Times New Roman" w:cs="Times New Roman" w:eastAsia="Times New Roman" w:hAnsi="Times New Roman"/>
+          <w:i/>
+          <w:iCs/>
+          <w:color w:val="6B7280"/>
+          <w:sz w:val="20"/>
+          <w:szCs w:val="20"/>
+        </w:rPr>
+        <w:t xml:space="preserve">[Corrigé le 20/09/2026 : la note disait « page JavaScript-only, inaccessible via fetch et curl » et renvoyait à des « sources secondaires ».]</w:t>
       </w:r>
     </w:p>
     <w:p>
@@ -6389,6 +6515,149 @@
       </w:pPr>
       <w:r>
         <w:t xml:space="preserve"/>
+      </w:r>
+    </w:p>
+    <w:p>
+      <w:pPr>
+        <w:pStyle w:val="Heading2"/>
+        <w:spacing w:after="100" w:before="280"/>
+      </w:pPr>
+      <w:r>
+        <w:rPr>
+          <w:rFonts w:ascii="Times New Roman" w:cs="Times New Roman" w:eastAsia="Times New Roman" w:hAnsi="Times New Roman"/>
+          <w:b/>
+          <w:bCs/>
+          <w:color w:val="1B3A6B"/>
+          <w:sz w:val="30"/>
+          <w:szCs w:val="30"/>
+        </w:rPr>
+        <w:t xml:space="preserve">📝 Journal des corrections (20/09/2026)</w:t>
+      </w:r>
+    </w:p>
+    <w:p>
+      <w:pPr>
+        <w:spacing w:after="60" w:before="60"/>
+      </w:pPr>
+      <w:r>
+        <w:rPr>
+          <w:rFonts w:ascii="Times New Roman" w:cs="Times New Roman" w:eastAsia="Times New Roman" w:hAnsi="Times New Roman"/>
+          <w:color w:val="1F2937"/>
+          <w:sz w:val="22"/>
+          <w:szCs w:val="22"/>
+        </w:rPr>
+        <w:t xml:space="preserve">Relecture du 20/09/2026, chaque page rouverte. Les corrections sont intégrées ci-dessus avec un marqueur daté ; ce journal garde la formulation d'origine. Les grilles API, Gumroad, n8n, UptimeRobot et l'arithmétique du Challenge n'ont pas changé.</w:t>
+      </w:r>
+    </w:p>
+    <w:p>
+      <w:pPr>
+        <w:spacing w:after="60" w:before="60"/>
+      </w:pPr>
+      <w:r>
+        <w:rPr>
+          <w:rFonts w:ascii="Times New Roman" w:cs="Times New Roman" w:eastAsia="Times New Roman" w:hAnsi="Times New Roman"/>
+          <w:color w:val="1F2937"/>
+          <w:sz w:val="22"/>
+          <w:szCs w:val="22"/>
+        </w:rPr>
+        <w:t xml:space="preserve">• Tableau n8n : « Tous les tarifs cloud sont facturés annuellement » — la page propose Monthly / Annually (Save 17%).</w:t>
+      </w:r>
+    </w:p>
+    <w:p>
+      <w:pPr>
+        <w:spacing w:after="60" w:before="60"/>
+      </w:pPr>
+      <w:r>
+        <w:rPr>
+          <w:rFonts w:ascii="Times New Roman" w:cs="Times New Roman" w:eastAsia="Times New Roman" w:hAnsi="Times New Roman"/>
+          <w:color w:val="1F2937"/>
+          <w:sz w:val="22"/>
+          <w:szCs w:val="22"/>
+        </w:rPr>
+        <w:t xml:space="preserve">• Tableau analytics : « ⚠️ Source secondaire — page plausible.io/pricing non lisible (JS requis, ⛔) » — l'adresse répond 404 ; la page d'accueil porte Starter « $9 /month », « Up to 10k monthly pageviews ».</w:t>
+      </w:r>
+    </w:p>
+    <w:p>
+      <w:pPr>
+        <w:spacing w:after="60" w:before="60"/>
+      </w:pPr>
+      <w:r>
+        <w:rPr>
+          <w:rFonts w:ascii="Times New Roman" w:cs="Times New Roman" w:eastAsia="Times New Roman" w:hAnsi="Times New Roman"/>
+          <w:color w:val="1F2937"/>
+          <w:sz w:val="22"/>
+          <w:szCs w:val="22"/>
+        </w:rPr>
+        <w:t xml:space="preserve">• Ressources : « Plausible Analytics — tarifs (⛔ page JS-only, non lue lors de cette exécution) » → https://plausible.io/pricing — HTTP 404.</w:t>
+      </w:r>
+    </w:p>
+    <w:p>
+      <w:pPr>
+        <w:spacing w:after="60" w:before="60"/>
+      </w:pPr>
+      <w:r>
+        <w:rPr>
+          <w:rFonts w:ascii="Times New Roman" w:cs="Times New Roman" w:eastAsia="Times New Roman" w:hAnsi="Times New Roman"/>
+          <w:color w:val="1F2937"/>
+          <w:sz w:val="22"/>
+          <w:szCs w:val="22"/>
+        </w:rPr>
+        <w:t xml:space="preserve">• Ancrage : « Zapier a changé sa grille tarifaire plusieurs fois en 5 ans. n8n a migré ses utilisateurs cloud vers une nouvelle tarification en 2024. » — sans source.</w:t>
+      </w:r>
+    </w:p>
+    <w:p>
+      <w:pPr>
+        <w:spacing w:after="60" w:before="60"/>
+      </w:pPr>
+      <w:r>
+        <w:rPr>
+          <w:rFonts w:ascii="Times New Roman" w:cs="Times New Roman" w:eastAsia="Times New Roman" w:hAnsi="Times New Roman"/>
+          <w:color w:val="1F2937"/>
+          <w:sz w:val="22"/>
+          <w:szCs w:val="22"/>
+        </w:rPr>
+        <w:t xml:space="preserve">• Signaux d'alerte : « Garantie de résultat sur un revenu : illégale en France (art. L121-2 du Code de la consommation) ».</w:t>
+      </w:r>
+    </w:p>
+    <w:p>
+      <w:pPr>
+        <w:spacing w:after="60" w:before="60"/>
+      </w:pPr>
+      <w:r>
+        <w:rPr>
+          <w:rFonts w:ascii="Times New Roman" w:cs="Times New Roman" w:eastAsia="Times New Roman" w:hAnsi="Times New Roman"/>
+          <w:color w:val="1F2937"/>
+          <w:sz w:val="22"/>
+          <w:szCs w:val="22"/>
+        </w:rPr>
+        <w:t xml:space="preserve">• Ancrage : « L'AMF a publié des mises en garde contre les offres frauduleuses liées aux robots de trading et aux formations à l'investissement (source : amf-france.org) » — la page listée ne le porte pas.</w:t>
+      </w:r>
+    </w:p>
+    <w:p>
+      <w:pPr>
+        <w:spacing w:after="60" w:before="60"/>
+      </w:pPr>
+      <w:r>
+        <w:rPr>
+          <w:rFonts w:ascii="Times New Roman" w:cs="Times New Roman" w:eastAsia="Times New Roman" w:hAnsi="Times New Roman"/>
+          <w:color w:val="1F2937"/>
+          <w:sz w:val="22"/>
+          <w:szCs w:val="22"/>
+        </w:rPr>
+        <w:t xml:space="preserve">• Corrigé de l'exercice 1 : « 50 ventes/mois (… 50 tâches Zapier …) · Zapier Free ($0) : suffisant — 50 tâches &lt; plafond de 100 » ; « 500 ventes … 500 tâches Zapier … Professional 750 tâches » ; « Si vous dépassez 100 ventes/mois avec Zapier Free » — une tâche par vente au lieu de trois, et un plan gratuit limité à deux étapes donné pour suffisant.</w:t>
+      </w:r>
+    </w:p>
+    <w:p>
+      <w:pPr>
+        <w:spacing w:after="60" w:before="60"/>
+      </w:pPr>
+      <w:r>
+        <w:rPr>
+          <w:rFonts w:ascii="Times New Roman" w:cs="Times New Roman" w:eastAsia="Times New Roman" w:hAnsi="Times New Roman"/>
+          <w:color w:val="1F2937"/>
+          <w:sz w:val="22"/>
+          <w:szCs w:val="22"/>
+        </w:rPr>
+        <w:t xml:space="preserve">• Challenge : « 20 workflows × 3 modules = 60 crédits » — le déclencheur est un module, Make le compte.</w:t>
       </w:r>
     </w:p>
     <w:sectPr>

</xml_diff>